<commit_message>
Add in-app connection setup screen (no code editing)
- RelaySettings: SharedPreferences-backed relay URL + addresses, replacing
  the hardcoded RelayConfig. Blank = fully offline (default).
- SetupScreen (⚙ in the chat top bar): paste the relay URL and the two
  addresses, Save & connect (or Go offline). Saving persists and recreates
  the activity so it reconnects with the new settings.
- MainActivity reads RelaySettings and routes to the setup screen.
- Word guide updated with the no-code in-app setup steps.

Co-Authored-By: Claude Opus 4.8 <noreply@anthropic.com>
Claude-Session: https://claude.ai/code/session_0193Ymccj9Gpb2zDz1EA8hdK
</commit_message>
<xml_diff>
--- a/subzero/docs/SubZero-Guide.docx
+++ b/subzero/docs/SubZero-Guide.docx
@@ -998,7 +998,75 @@
         <w:spacing w:after="120"/>
       </w:pPr>
       <w:r>
-        <w:t xml:space="preserve">Out of the box the app runs fully on the phone (great for trying every feature). For the two of us to actually send messages to each other over the internet, there's a small free “relay” server that passes along our encrypted messages — it can never read them. It can be deployed in a few minutes to a free host (Render, Railway, or Fly.io), and then the app is pointed at its address. I can set this up whenever you want; ask me and I'll walk you through it.</w:t>
+        <w:t xml:space="preserve">Out of the box the app runs fully on the phone (great for trying every feature). For the two of us to actually send messages to each other over the internet, there's a small free “relay” server that passes along our encrypted messages — it can never read them. It's deployed once to a free host (Render, Railway, or Fly.io).</w:t>
+      </w:r>
+    </w:p>
+    <w:p>
+      <w:pPr>
+        <w:spacing w:after="120"/>
+      </w:pPr>
+      <w:r>
+        <w:t xml:space="preserve">Then it's set up right inside the app — no code:</w:t>
+      </w:r>
+    </w:p>
+    <w:p>
+      <w:pPr>
+        <w:pStyle w:val="ListParagraph"/>
+        <w:numPr>
+          <w:ilvl w:val="0"/>
+          <w:numId w:val="3"/>
+        </w:numPr>
+        <w:spacing w:after="80"/>
+      </w:pPr>
+      <w:r>
+        <w:t xml:space="preserve">Tap the gear (⚙) icon at the top of the chat.</w:t>
+      </w:r>
+    </w:p>
+    <w:p>
+      <w:pPr>
+        <w:pStyle w:val="ListParagraph"/>
+        <w:numPr>
+          <w:ilvl w:val="0"/>
+          <w:numId w:val="3"/>
+        </w:numPr>
+        <w:spacing w:after="80"/>
+      </w:pPr>
+      <w:r>
+        <w:t xml:space="preserve">Paste the relay address (looks like wss://…) into “Relay URL”.</w:t>
+      </w:r>
+    </w:p>
+    <w:p>
+      <w:pPr>
+        <w:pStyle w:val="ListParagraph"/>
+        <w:numPr>
+          <w:ilvl w:val="0"/>
+          <w:numId w:val="3"/>
+        </w:numPr>
+        <w:spacing w:after="80"/>
+      </w:pPr>
+      <w:r>
+        <w:t xml:space="preserve">Put your name in “Your address” and mine in “Their address” (we each do the opposite on our own phone).</w:t>
+      </w:r>
+    </w:p>
+    <w:p>
+      <w:pPr>
+        <w:pStyle w:val="ListParagraph"/>
+        <w:numPr>
+          <w:ilvl w:val="0"/>
+          <w:numId w:val="3"/>
+        </w:numPr>
+        <w:spacing w:after="80"/>
+      </w:pPr>
+      <w:r>
+        <w:t xml:space="preserve">Tap “Save &amp; connect.” That's it — messages now go between us, still end-to-end encrypted.</w:t>
+      </w:r>
+    </w:p>
+    <w:p>
+      <w:pPr>
+        <w:spacing w:after="120"/>
+      </w:pPr>
+      <w:r>
+        <w:t xml:space="preserve">I can deploy the relay for you and give you the exact address to paste; just ask.</w:t>
       </w:r>
     </w:p>
     <w:p>

</xml_diff>